<commit_message>
docs(docx): homologar estados Dim_Cobro a espanol en documento Word
</commit_message>
<xml_diff>
--- a/Contexto/Archivo Anexos Informe.docx
+++ b/Contexto/Archivo Anexos Informe.docx
@@ -9612,7 +9612,7 @@
     </w:p>
     <w:p>
       <w:r>
-        <w:t xml:space="preserve">    SELECT 1 AS KeyCobro, 'VALIDATED' AS EstadoPago, 'SI' AS ComprobanteAdjunto</w:t>
+        <w:t xml:space="preserve">    SELECT 1 AS KeyCobro, 'Validado' AS EstadoPago, 'SI' AS ComprobanteAdjunto</w:t>
       </w:r>
     </w:p>
     <w:p>
@@ -9663,7 +9663,7 @@
     </w:p>
     <w:p>
       <w:r>
-        <w:t xml:space="preserve">    SELECT 1 AS KeyCobro, 'VALIDATED' AS EstadoPago, 'SI' AS ComprobanteAdjunto</w:t>
+        <w:t xml:space="preserve">    SELECT 1 AS KeyCobro, 'Validado' AS EstadoPago, 'SI' AS ComprobanteAdjunto</w:t>
       </w:r>
     </w:p>
     <w:p>
@@ -11513,7 +11513,7 @@
     </w:p>
     <w:p>
       <w:r>
-        <w:t xml:space="preserve">    SELECT 1 AS KeyCobro, 'VALIDATED' AS EstadoPago, 'SI' AS ComprobanteAdjunto</w:t>
+        <w:t xml:space="preserve">    SELECT 1 AS KeyCobro, 'Validado' AS EstadoPago, 'SI' AS ComprobanteAdjunto</w:t>
       </w:r>
     </w:p>
     <w:p>
@@ -11564,7 +11564,7 @@
     </w:p>
     <w:p>
       <w:r>
-        <w:t xml:space="preserve">    SELECT 1 AS KeyCobro, 'VALIDATED' AS EstadoPago, 'SI' AS ComprobanteAdjunto</w:t>
+        <w:t xml:space="preserve">    SELECT 1 AS KeyCobro, 'Validado' AS EstadoPago, 'SI' AS ComprobanteAdjunto</w:t>
       </w:r>
     </w:p>
     <w:p>
@@ -13351,7 +13351,7 @@
     </w:p>
     <w:p>
       <w:r>
-        <w:t xml:space="preserve">            WHEN p.estado IN ('Confirmado', 'Validado', 'VALIDATED', 'VALIDADO') THEN 1</w:t>
+        <w:t xml:space="preserve">            WHEN p.estado IN ('Confirmado', 'Validado', 'Validado', 'VALIDADO') THEN 1</w:t>
       </w:r>
     </w:p>
     <w:p>
@@ -13391,7 +13391,7 @@
     </w:p>
     <w:p>
       <w:r>
-        <w:t xml:space="preserve">        SUM(CASE WHEN p.estado IN ('Validado', 'VALIDADO', 'Confirmado', 'VALIDATED') THEN 1 ELSE 0 END) AS PagosValidados,</w:t>
+        <w:t xml:space="preserve">        SUM(CASE WHEN p.estado IN ('Validado', 'VALIDADO', 'Confirmado', 'Validado') THEN 1 ELSE 0 END) AS PagosValidados,</w:t>
       </w:r>
     </w:p>
     <w:p>
@@ -13491,7 +13491,7 @@
     </w:p>
     <w:p>
       <w:r>
-        <w:t xml:space="preserve">            WHEN p.estado IN ('Confirmado', 'Validado', 'VALIDATED', 'VALIDADO') THEN 1</w:t>
+        <w:t xml:space="preserve">            WHEN p.estado IN ('Confirmado', 'Validado', 'Validado', 'VALIDADO') THEN 1</w:t>
       </w:r>
     </w:p>
     <w:p>

</xml_diff>

<commit_message>
docs(anexos): declarar PRIMARY KEY compuesta en las 5 tablas de hechos en Anexo D
</commit_message>
<xml_diff>
--- a/Contexto/Archivo Anexos Informe.docx
+++ b/Contexto/Archivo Anexos Informe.docx
@@ -6691,7 +6691,9 @@
         <w:t>-- ====================================================================</w:t>
       </w:r>
     </w:p>
-    <w:p/>
+    <w:p>
+      <w:r/>
+    </w:p>
     <w:p>
       <w:r>
         <w:t>IF NOT EXISTS (SELECT 1 FROM sys.databases WHERE name = 'NexoSalud_Mart')</w:t>
@@ -6717,7 +6719,9 @@
         <w:t>GO</w:t>
       </w:r>
     </w:p>
-    <w:p/>
+    <w:p>
+      <w:r/>
+    </w:p>
     <w:p>
       <w:r>
         <w:t>USE NexoSalud_Mart;</w:t>
@@ -6728,7 +6732,9 @@
         <w:t>GO</w:t>
       </w:r>
     </w:p>
-    <w:p/>
+    <w:p>
+      <w:r/>
+    </w:p>
     <w:p>
       <w:r>
         <w:t>SET ANSI_NULLS ON;</w:t>
@@ -6749,7 +6755,9 @@
         <w:t>GO</w:t>
       </w:r>
     </w:p>
-    <w:p/>
+    <w:p>
+      <w:r/>
+    </w:p>
     <w:p>
       <w:r>
         <w:t>-- ====================================================================</w:t>
@@ -6765,7 +6773,9 @@
         <w:t>-- ====================================================================</w:t>
       </w:r>
     </w:p>
-    <w:p/>
+    <w:p>
+      <w:r/>
+    </w:p>
     <w:p>
       <w:r>
         <w:t>-- 1.1 Dimensión Tiempo (Conformada para las etapas analíticas)</w:t>
@@ -6821,7 +6831,9 @@
         <w:t>GO</w:t>
       </w:r>
     </w:p>
-    <w:p/>
+    <w:p>
+      <w:r/>
+    </w:p>
     <w:p>
       <w:r>
         <w:t>-- 1.2 Dimensión Hora (Para PAYER y CUSTOMER)</w:t>
@@ -6872,7 +6884,9 @@
         <w:t>GO</w:t>
       </w:r>
     </w:p>
-    <w:p/>
+    <w:p>
+      <w:r/>
+    </w:p>
     <w:p>
       <w:r>
         <w:t>-- 1.3 Dimensión Sede (Conformada para las etapas clínicas y comerciales)</w:t>
@@ -6923,7 +6937,9 @@
         <w:t>GO</w:t>
       </w:r>
     </w:p>
-    <w:p/>
+    <w:p>
+      <w:r/>
+    </w:p>
     <w:p>
       <w:r>
         <w:t>-- 1.4 Dimensión Servicio (Conformada para las etapas analíticas)</w:t>
@@ -6974,7 +6990,9 @@
         <w:t>GO</w:t>
       </w:r>
     </w:p>
-    <w:p/>
+    <w:p>
+      <w:r/>
+    </w:p>
     <w:p>
       <w:r>
         <w:t>-- 1.5 Dimensión Canal (Para BUYER y SEGUIMIENTO)</w:t>
@@ -7020,7 +7038,9 @@
         <w:t>GO</w:t>
       </w:r>
     </w:p>
-    <w:p/>
+    <w:p>
+      <w:r/>
+    </w:p>
     <w:p>
       <w:r>
         <w:t>-- 1.6 Dimensión Fuente / Campaña (Para BUYER)</w:t>
@@ -7071,7 +7091,9 @@
         <w:t>GO</w:t>
       </w:r>
     </w:p>
-    <w:p/>
+    <w:p>
+      <w:r/>
+    </w:p>
     <w:p>
       <w:r>
         <w:t>-- 1.7 Dimensión Estado del Registro (Para BUYER)</w:t>
@@ -7112,7 +7134,9 @@
         <w:t>GO</w:t>
       </w:r>
     </w:p>
-    <w:p/>
+    <w:p>
+      <w:r/>
+    </w:p>
     <w:p>
       <w:r>
         <w:t>-- 1.8 Dimensión Tipo Persona / Perfil Buyer</w:t>
@@ -7158,7 +7182,9 @@
         <w:t>GO</w:t>
       </w:r>
     </w:p>
-    <w:p/>
+    <w:p>
+      <w:r/>
+    </w:p>
     <w:p>
       <w:r>
         <w:t>-- 1.9 Dimensión Pagador (Para PAYER)</w:t>
@@ -7214,7 +7240,9 @@
         <w:t>GO</w:t>
       </w:r>
     </w:p>
-    <w:p/>
+    <w:p>
+      <w:r/>
+    </w:p>
     <w:p>
       <w:r>
         <w:t>-- 1.10 Dimensión Profesional (Para LEAD, CUSTOMER y TURNED)</w:t>
@@ -7260,7 +7288,9 @@
         <w:t>GO</w:t>
       </w:r>
     </w:p>
-    <w:p/>
+    <w:p>
+      <w:r/>
+    </w:p>
     <w:p>
       <w:r>
         <w:t>-- 1.11 Dimensión Negociador (Para LEAD)</w:t>
@@ -7301,7 +7331,9 @@
         <w:t>GO</w:t>
       </w:r>
     </w:p>
-    <w:p/>
+    <w:p>
+      <w:r/>
+    </w:p>
     <w:p>
       <w:r>
         <w:t>-- 1.12 Dimensión Pasarela (Para PAYER)</w:t>
@@ -7347,7 +7379,9 @@
         <w:t>GO</w:t>
       </w:r>
     </w:p>
-    <w:p/>
+    <w:p>
+      <w:r/>
+    </w:p>
     <w:p>
       <w:r>
         <w:t>-- 1.13 Dimensión Cobro (Para PAYER)</w:t>
@@ -7388,7 +7422,9 @@
         <w:t>GO</w:t>
       </w:r>
     </w:p>
-    <w:p/>
+    <w:p>
+      <w:r/>
+    </w:p>
     <w:p>
       <w:r>
         <w:t>-- 1.14 Dimensión Estado Atención (Para CUSTOMER)</w:t>
@@ -7429,7 +7465,9 @@
         <w:t>GO</w:t>
       </w:r>
     </w:p>
-    <w:p/>
+    <w:p>
+      <w:r/>
+    </w:p>
     <w:p>
       <w:r>
         <w:t>-- ====================================================================</w:t>
@@ -7437,7 +7475,7 @@
     </w:p>
     <w:p>
       <w:r>
-        <w:t>-- 2. CREACIÓN DE TABLAS DE HECHOS (FACT TABLES)</w:t>
+        <w:t>-- 2. CREACIÓN DE TABLAS DE HECHOS (FACT TABLES CON LLAVE PRIMARIA COMPUESTA)</w:t>
       </w:r>
     </w:p>
     <w:p>
@@ -7445,10 +7483,12 @@
         <w:t>-- ====================================================================</w:t>
       </w:r>
     </w:p>
-    <w:p/>
-    <w:p>
-      <w:r>
-        <w:t>-- 2.1 Hecho: CAPTACIÓN BUYER</w:t>
+    <w:p>
+      <w:r/>
+    </w:p>
+    <w:p>
+      <w:r>
+        <w:t>-- 2.1 Hecho: CAPTACIÓN BUYER (Grano: Día, Sede, Canal, Fuente, Estado Calidad)</w:t>
       </w:r>
     </w:p>
     <w:p>
@@ -7463,37 +7503,37 @@
     </w:p>
     <w:p>
       <w:r>
-        <w:t xml:space="preserve">    KeyTiempo INT FOREIGN KEY REFERENCES dbo.Dim_Tiempo(KeyTiempo),</w:t>
-      </w:r>
-    </w:p>
-    <w:p>
-      <w:r>
-        <w:t xml:space="preserve">    KeySede INT FOREIGN KEY REFERENCES dbo.Dim_Sede(KeySede),</w:t>
-      </w:r>
-    </w:p>
-    <w:p>
-      <w:r>
-        <w:t xml:space="preserve">    KeyServicio INT FOREIGN KEY REFERENCES dbo.Dim_Servicio(KeyServicio),</w:t>
-      </w:r>
-    </w:p>
-    <w:p>
-      <w:r>
-        <w:t xml:space="preserve">    KeyCanal INT FOREIGN KEY REFERENCES dbo.Dim_Canal(KeyCanal),</w:t>
-      </w:r>
-    </w:p>
-    <w:p>
-      <w:r>
-        <w:t xml:space="preserve">    KeyFuente INT FOREIGN KEY REFERENCES dbo.Dim_Fuente(KeyFuente),</w:t>
-      </w:r>
-    </w:p>
-    <w:p>
-      <w:r>
-        <w:t xml:space="preserve">    KeyTipoPersona INT FOREIGN KEY REFERENCES dbo.Dim_TipoPersona(KeyTipoPersona),</w:t>
-      </w:r>
-    </w:p>
-    <w:p>
-      <w:r>
-        <w:t xml:space="preserve">    KeyEstadoRegistro INT FOREIGN KEY REFERENCES dbo.Dim_EstadoRegistro(KeyEstadoRegistro),</w:t>
+        <w:t xml:space="preserve">    KeyTiempo INT NOT NULL FOREIGN KEY REFERENCES dbo.Dim_Tiempo(KeyTiempo),</w:t>
+      </w:r>
+    </w:p>
+    <w:p>
+      <w:r>
+        <w:t xml:space="preserve">    KeySede INT NOT NULL FOREIGN KEY REFERENCES dbo.Dim_Sede(KeySede),</w:t>
+      </w:r>
+    </w:p>
+    <w:p>
+      <w:r>
+        <w:t xml:space="preserve">    KeyServicio INT NULL FOREIGN KEY REFERENCES dbo.Dim_Servicio(KeyServicio),</w:t>
+      </w:r>
+    </w:p>
+    <w:p>
+      <w:r>
+        <w:t xml:space="preserve">    KeyCanal INT NOT NULL FOREIGN KEY REFERENCES dbo.Dim_Canal(KeyCanal),</w:t>
+      </w:r>
+    </w:p>
+    <w:p>
+      <w:r>
+        <w:t xml:space="preserve">    KeyFuente INT NOT NULL FOREIGN KEY REFERENCES dbo.Dim_Fuente(KeyFuente),</w:t>
+      </w:r>
+    </w:p>
+    <w:p>
+      <w:r>
+        <w:t xml:space="preserve">    KeyTipoPersona INT NULL FOREIGN KEY REFERENCES dbo.Dim_TipoPersona(KeyTipoPersona),</w:t>
+      </w:r>
+    </w:p>
+    <w:p>
+      <w:r>
+        <w:t xml:space="preserve">    KeyEstadoRegistro INT NOT NULL FOREIGN KEY REFERENCES dbo.Dim_EstadoRegistro(KeyEstadoRegistro),</w:t>
       </w:r>
     </w:p>
     <w:p>
@@ -7528,7 +7568,15 @@
     </w:p>
     <w:p>
       <w:r>
-        <w:t xml:space="preserve">    CostoAtribuidoCaptacion DECIMAL(10,2) DEFAULT 0.00</w:t>
+        <w:t xml:space="preserve">    CostoAtribuidoCaptacion DECIMAL(10,2) DEFAULT 0.00,</w:t>
+      </w:r>
+    </w:p>
+    <w:p>
+      <w:r/>
+    </w:p>
+    <w:p>
+      <w:r>
+        <w:t xml:space="preserve">    CONSTRAINT PK_Fact_CaptacionBuyer PRIMARY KEY (KeyTiempo, KeySede, KeyCanal, KeyFuente, KeyEstadoRegistro)</w:t>
       </w:r>
     </w:p>
     <w:p>
@@ -7541,10 +7589,12 @@
         <w:t>GO</w:t>
       </w:r>
     </w:p>
-    <w:p/>
-    <w:p>
-      <w:r>
-        <w:t>-- 2.2 Hecho: NEGOCIACIÓN LEAD</w:t>
+    <w:p>
+      <w:r/>
+    </w:p>
+    <w:p>
+      <w:r>
+        <w:t>-- 2.2 Hecho: NEGOCIACIÓN LEAD (Grano: Día, Sede, Servicio, Profesional, Negociador)</w:t>
       </w:r>
     </w:p>
     <w:p>
@@ -7559,27 +7609,27 @@
     </w:p>
     <w:p>
       <w:r>
-        <w:t xml:space="preserve">    KeyTiempo INT FOREIGN KEY REFERENCES dbo.Dim_Tiempo(KeyTiempo),</w:t>
-      </w:r>
-    </w:p>
-    <w:p>
-      <w:r>
-        <w:t xml:space="preserve">    KeySede INT FOREIGN KEY REFERENCES dbo.Dim_Sede(KeySede),</w:t>
-      </w:r>
-    </w:p>
-    <w:p>
-      <w:r>
-        <w:t xml:space="preserve">    KeyServicio INT FOREIGN KEY REFERENCES dbo.Dim_Servicio(KeyServicio),</w:t>
-      </w:r>
-    </w:p>
-    <w:p>
-      <w:r>
-        <w:t xml:space="preserve">    KeyProfesional INT FOREIGN KEY REFERENCES dbo.Dim_Profesional(KeyProfesional),</w:t>
-      </w:r>
-    </w:p>
-    <w:p>
-      <w:r>
-        <w:t xml:space="preserve">    KeyNegociador INT FOREIGN KEY REFERENCES dbo.Dim_Negociador(KeyNegociador),</w:t>
+        <w:t xml:space="preserve">    KeyTiempo INT NOT NULL FOREIGN KEY REFERENCES dbo.Dim_Tiempo(KeyTiempo),</w:t>
+      </w:r>
+    </w:p>
+    <w:p>
+      <w:r>
+        <w:t xml:space="preserve">    KeySede INT NOT NULL FOREIGN KEY REFERENCES dbo.Dim_Sede(KeySede),</w:t>
+      </w:r>
+    </w:p>
+    <w:p>
+      <w:r>
+        <w:t xml:space="preserve">    KeyServicio INT NOT NULL FOREIGN KEY REFERENCES dbo.Dim_Servicio(KeyServicio),</w:t>
+      </w:r>
+    </w:p>
+    <w:p>
+      <w:r>
+        <w:t xml:space="preserve">    KeyProfesional INT NOT NULL FOREIGN KEY REFERENCES dbo.Dim_Profesional(KeyProfesional),</w:t>
+      </w:r>
+    </w:p>
+    <w:p>
+      <w:r>
+        <w:t xml:space="preserve">    KeyNegociador INT NOT NULL FOREIGN KEY REFERENCES dbo.Dim_Negociador(KeyNegociador),</w:t>
       </w:r>
     </w:p>
     <w:p>
@@ -7624,7 +7674,15 @@
     </w:p>
     <w:p>
       <w:r>
-        <w:t xml:space="preserve">    LeadsEnNegociacion INT DEFAULT 0</w:t>
+        <w:t xml:space="preserve">    LeadsEnNegociacion INT DEFAULT 0,</w:t>
+      </w:r>
+    </w:p>
+    <w:p>
+      <w:r/>
+    </w:p>
+    <w:p>
+      <w:r>
+        <w:t xml:space="preserve">    CONSTRAINT PK_Fact_NegociacionLead PRIMARY KEY (KeyTiempo, KeySede, KeyServicio, KeyProfesional, KeyNegociador)</w:t>
       </w:r>
     </w:p>
     <w:p>
@@ -7637,10 +7695,12 @@
         <w:t>GO</w:t>
       </w:r>
     </w:p>
-    <w:p/>
-    <w:p>
-      <w:r>
-        <w:t>-- 2.3 Hecho: GESTIÓN PAYER</w:t>
+    <w:p>
+      <w:r/>
+    </w:p>
+    <w:p>
+      <w:r>
+        <w:t>-- 2.3 Hecho: GESTIÓN PAYER (Grano: Día, Pasarela, Cobro, Sede, Servicio)</w:t>
       </w:r>
     </w:p>
     <w:p>
@@ -7655,42 +7715,42 @@
     </w:p>
     <w:p>
       <w:r>
-        <w:t xml:space="preserve">    KeyTiempo INT FOREIGN KEY REFERENCES dbo.Dim_Tiempo(KeyTiempo),</w:t>
-      </w:r>
-    </w:p>
-    <w:p>
-      <w:r>
-        <w:t xml:space="preserve">    KeyHora INT FOREIGN KEY REFERENCES dbo.Dim_Hora(KeyHora),</w:t>
-      </w:r>
-    </w:p>
-    <w:p>
-      <w:r>
-        <w:t xml:space="preserve">    KeySede INT FOREIGN KEY REFERENCES dbo.Dim_Sede(KeySede),</w:t>
-      </w:r>
-    </w:p>
-    <w:p>
-      <w:r>
-        <w:t xml:space="preserve">    KeyServicio INT FOREIGN KEY REFERENCES dbo.Dim_Servicio(KeyServicio),</w:t>
-      </w:r>
-    </w:p>
-    <w:p>
-      <w:r>
-        <w:t xml:space="preserve">    KeyFuente INT FOREIGN KEY REFERENCES dbo.Dim_Fuente(KeyFuente),</w:t>
-      </w:r>
-    </w:p>
-    <w:p>
-      <w:r>
-        <w:t xml:space="preserve">    KeyPasarela INT FOREIGN KEY REFERENCES dbo.Dim_Pasarela(KeyPasarela),</w:t>
-      </w:r>
-    </w:p>
-    <w:p>
-      <w:r>
-        <w:t xml:space="preserve">    KeyPagador INT FOREIGN KEY REFERENCES dbo.Dim_Pagador(KeyPagador),</w:t>
-      </w:r>
-    </w:p>
-    <w:p>
-      <w:r>
-        <w:t xml:space="preserve">    KeyCobro INT FOREIGN KEY REFERENCES dbo.Dim_Cobro(KeyCobro),</w:t>
+        <w:t xml:space="preserve">    KeyTiempo INT NOT NULL FOREIGN KEY REFERENCES dbo.Dim_Tiempo(KeyTiempo),</w:t>
+      </w:r>
+    </w:p>
+    <w:p>
+      <w:r>
+        <w:t xml:space="preserve">    KeyHora INT NULL FOREIGN KEY REFERENCES dbo.Dim_Hora(KeyHora),</w:t>
+      </w:r>
+    </w:p>
+    <w:p>
+      <w:r>
+        <w:t xml:space="preserve">    KeySede INT NOT NULL FOREIGN KEY REFERENCES dbo.Dim_Sede(KeySede),</w:t>
+      </w:r>
+    </w:p>
+    <w:p>
+      <w:r>
+        <w:t xml:space="preserve">    KeyServicio INT NOT NULL FOREIGN KEY REFERENCES dbo.Dim_Servicio(KeyServicio),</w:t>
+      </w:r>
+    </w:p>
+    <w:p>
+      <w:r>
+        <w:t xml:space="preserve">    KeyFuente INT NULL FOREIGN KEY REFERENCES dbo.Dim_Fuente(KeyFuente),</w:t>
+      </w:r>
+    </w:p>
+    <w:p>
+      <w:r>
+        <w:t xml:space="preserve">    KeyPasarela INT NOT NULL FOREIGN KEY REFERENCES dbo.Dim_Pasarela(KeyPasarela),</w:t>
+      </w:r>
+    </w:p>
+    <w:p>
+      <w:r>
+        <w:t xml:space="preserve">    KeyPagador INT NULL FOREIGN KEY REFERENCES dbo.Dim_Pagador(KeyPagador),</w:t>
+      </w:r>
+    </w:p>
+    <w:p>
+      <w:r>
+        <w:t xml:space="preserve">    KeyCobro INT NOT NULL FOREIGN KEY REFERENCES dbo.Dim_Cobro(KeyCobro),</w:t>
       </w:r>
     </w:p>
     <w:p>
@@ -7735,7 +7795,15 @@
     </w:p>
     <w:p>
       <w:r>
-        <w:t xml:space="preserve">    TiempoTotalValidacionMin INT DEFAULT 0</w:t>
+        <w:t xml:space="preserve">    TiempoTotalValidacionMin INT DEFAULT 0,</w:t>
+      </w:r>
+    </w:p>
+    <w:p>
+      <w:r/>
+    </w:p>
+    <w:p>
+      <w:r>
+        <w:t xml:space="preserve">    CONSTRAINT PK_Fact_GestionPayer PRIMARY KEY (KeyTiempo, KeyPasarela, KeyCobro, KeySede, KeyServicio)</w:t>
       </w:r>
     </w:p>
     <w:p>
@@ -7748,10 +7816,12 @@
         <w:t>GO</w:t>
       </w:r>
     </w:p>
-    <w:p/>
-    <w:p>
-      <w:r>
-        <w:t>-- 2.4 Hecho: ATENCIÓN CUSTOMER</w:t>
+    <w:p>
+      <w:r/>
+    </w:p>
+    <w:p>
+      <w:r>
+        <w:t>-- 2.4 Hecho: ATENCIÓN CUSTOMER (Grano: Día, Sede, Servicio, Profesional, Estado Atención)</w:t>
       </w:r>
     </w:p>
     <w:p>
@@ -7766,32 +7836,32 @@
     </w:p>
     <w:p>
       <w:r>
-        <w:t xml:space="preserve">    KeyTiempo INT FOREIGN KEY REFERENCES dbo.Dim_Tiempo(KeyTiempo),</w:t>
-      </w:r>
-    </w:p>
-    <w:p>
-      <w:r>
-        <w:t xml:space="preserve">    KeyHora INT FOREIGN KEY REFERENCES dbo.Dim_Hora(KeyHora),</w:t>
-      </w:r>
-    </w:p>
-    <w:p>
-      <w:r>
-        <w:t xml:space="preserve">    KeySede INT FOREIGN KEY REFERENCES dbo.Dim_Sede(KeySede),</w:t>
-      </w:r>
-    </w:p>
-    <w:p>
-      <w:r>
-        <w:t xml:space="preserve">    KeyServicio INT FOREIGN KEY REFERENCES dbo.Dim_Servicio(KeyServicio),</w:t>
-      </w:r>
-    </w:p>
-    <w:p>
-      <w:r>
-        <w:t xml:space="preserve">    KeyProfesional INT FOREIGN KEY REFERENCES dbo.Dim_Profesional(KeyProfesional),</w:t>
-      </w:r>
-    </w:p>
-    <w:p>
-      <w:r>
-        <w:t xml:space="preserve">    KeyEstadoAtencion INT FOREIGN KEY REFERENCES dbo.Dim_EstadoAtencion(KeyEstadoAtencion),</w:t>
+        <w:t xml:space="preserve">    KeyTiempo INT NOT NULL FOREIGN KEY REFERENCES dbo.Dim_Tiempo(KeyTiempo),</w:t>
+      </w:r>
+    </w:p>
+    <w:p>
+      <w:r>
+        <w:t xml:space="preserve">    KeyHora INT NULL FOREIGN KEY REFERENCES dbo.Dim_Hora(KeyHora),</w:t>
+      </w:r>
+    </w:p>
+    <w:p>
+      <w:r>
+        <w:t xml:space="preserve">    KeySede INT NOT NULL FOREIGN KEY REFERENCES dbo.Dim_Sede(KeySede),</w:t>
+      </w:r>
+    </w:p>
+    <w:p>
+      <w:r>
+        <w:t xml:space="preserve">    KeyServicio INT NOT NULL FOREIGN KEY REFERENCES dbo.Dim_Servicio(KeyServicio),</w:t>
+      </w:r>
+    </w:p>
+    <w:p>
+      <w:r>
+        <w:t xml:space="preserve">    KeyProfesional INT NOT NULL FOREIGN KEY REFERENCES dbo.Dim_Profesional(KeyProfesional),</w:t>
+      </w:r>
+    </w:p>
+    <w:p>
+      <w:r>
+        <w:t xml:space="preserve">    KeyEstadoAtencion INT NOT NULL FOREIGN KEY REFERENCES dbo.Dim_EstadoAtencion(KeyEstadoAtencion),</w:t>
       </w:r>
     </w:p>
     <w:p>
@@ -7826,7 +7896,15 @@
     </w:p>
     <w:p>
       <w:r>
-        <w:t xml:space="preserve">    AtencionesFinalizadasConformes INT DEFAULT 0</w:t>
+        <w:t xml:space="preserve">    AtencionesFinalizadasConformes INT DEFAULT 0,</w:t>
+      </w:r>
+    </w:p>
+    <w:p>
+      <w:r/>
+    </w:p>
+    <w:p>
+      <w:r>
+        <w:t xml:space="preserve">    CONSTRAINT PK_Fact_AtencionCustomer PRIMARY KEY (KeyTiempo, KeySede, KeyServicio, KeyProfesional, KeyEstadoAtencion)</w:t>
       </w:r>
     </w:p>
     <w:p>
@@ -7839,10 +7917,12 @@
         <w:t>GO</w:t>
       </w:r>
     </w:p>
-    <w:p/>
-    <w:p>
-      <w:r>
-        <w:t>-- 2.5 Hecho: SEGUIMIENTO TURNED</w:t>
+    <w:p>
+      <w:r/>
+    </w:p>
+    <w:p>
+      <w:r>
+        <w:t>-- 2.5 Hecho: SEGUIMIENTO TURNED (Grano: Día, Sede, Servicio, Profesional, Canal)</w:t>
       </w:r>
     </w:p>
     <w:p>
@@ -7857,27 +7937,27 @@
     </w:p>
     <w:p>
       <w:r>
-        <w:t xml:space="preserve">    KeyTiempo INT FOREIGN KEY REFERENCES dbo.Dim_Tiempo(KeyTiempo),</w:t>
-      </w:r>
-    </w:p>
-    <w:p>
-      <w:r>
-        <w:t xml:space="preserve">    KeySede INT FOREIGN KEY REFERENCES dbo.Dim_Sede(KeySede),</w:t>
-      </w:r>
-    </w:p>
-    <w:p>
-      <w:r>
-        <w:t xml:space="preserve">    KeyServicio INT FOREIGN KEY REFERENCES dbo.Dim_Servicio(KeyServicio),</w:t>
-      </w:r>
-    </w:p>
-    <w:p>
-      <w:r>
-        <w:t xml:space="preserve">    KeyProfesional INT FOREIGN KEY REFERENCES dbo.Dim_Profesional(KeyProfesional),</w:t>
-      </w:r>
-    </w:p>
-    <w:p>
-      <w:r>
-        <w:t xml:space="preserve">    KeyCanal INT FOREIGN KEY REFERENCES dbo.Dim_Canal(KeyCanal),</w:t>
+        <w:t xml:space="preserve">    KeyTiempo INT NOT NULL FOREIGN KEY REFERENCES dbo.Dim_Tiempo(KeyTiempo),</w:t>
+      </w:r>
+    </w:p>
+    <w:p>
+      <w:r>
+        <w:t xml:space="preserve">    KeySede INT NOT NULL FOREIGN KEY REFERENCES dbo.Dim_Sede(KeySede),</w:t>
+      </w:r>
+    </w:p>
+    <w:p>
+      <w:r>
+        <w:t xml:space="preserve">    KeyServicio INT NOT NULL FOREIGN KEY REFERENCES dbo.Dim_Servicio(KeyServicio),</w:t>
+      </w:r>
+    </w:p>
+    <w:p>
+      <w:r>
+        <w:t xml:space="preserve">    KeyProfesional INT NOT NULL FOREIGN KEY REFERENCES dbo.Dim_Profesional(KeyProfesional),</w:t>
+      </w:r>
+    </w:p>
+    <w:p>
+      <w:r>
+        <w:t xml:space="preserve">    KeyCanal INT NOT NULL FOREIGN KEY REFERENCES dbo.Dim_Canal(KeyCanal),</w:t>
       </w:r>
     </w:p>
     <w:p>
@@ -7917,7 +7997,15 @@
     </w:p>
     <w:p>
       <w:r>
-        <w:t xml:space="preserve">    PacientesElegiblesRetorno INT DEFAULT 0</w:t>
+        <w:t xml:space="preserve">    PacientesElegiblesRetorno INT DEFAULT 0,</w:t>
+      </w:r>
+    </w:p>
+    <w:p>
+      <w:r/>
+    </w:p>
+    <w:p>
+      <w:r>
+        <w:t xml:space="preserve">    CONSTRAINT PK_Fact_SeguimientoTurned PRIMARY KEY (KeyTiempo, KeySede, KeyServicio, KeyProfesional, KeyCanal)</w:t>
       </w:r>
     </w:p>
     <w:p>
@@ -7933,88 +8021,16 @@
     <w:p/>
     <w:p>
       <w:r>
-        <w:t>-- ====================================================================</w:t>
-      </w:r>
-    </w:p>
-    <w:p>
-      <w:r>
-        <w:t>-- 3. ÍNDICES DE UNICIDAD FÍSICA PARA EL GRANO ANALÍTICO</w:t>
-      </w:r>
-    </w:p>
-    <w:p>
-      <w:r>
-        <w:t>-- ====================================================================</w:t>
-      </w:r>
-    </w:p>
-    <w:p>
-      <w:r>
-        <w:t>IF NOT EXISTS (SELECT 1 FROM sys.indexes WHERE name = 'UQ_FactCaptacionBuyer_Grain' AND object_id = OBJECT_ID('Fact_CaptacionBuyer'))</w:t>
-      </w:r>
-    </w:p>
-    <w:p>
-      <w:r>
-        <w:t xml:space="preserve">    CREATE UNIQUE NONCLUSTERED INDEX UQ_FactCaptacionBuyer_Grain </w:t>
-      </w:r>
-    </w:p>
-    <w:p>
-      <w:r>
-        <w:t xml:space="preserve">    ON Fact_CaptacionBuyer (KeyTiempo, KeySede, KeyCanal, KeyFuente, KeyEstadoRegistro);</w:t>
-      </w:r>
-    </w:p>
-    <w:p/>
-    <w:p>
-      <w:r>
-        <w:t>IF NOT EXISTS (SELECT 1 FROM sys.indexes WHERE name = 'UQ_FactNegociacionLead_Grain' AND object_id = OBJECT_ID('Fact_NegociacionLead'))</w:t>
-      </w:r>
-    </w:p>
-    <w:p>
-      <w:r>
-        <w:t xml:space="preserve">    CREATE UNIQUE NONCLUSTERED INDEX UQ_FactNegociacionLead_Grain </w:t>
-      </w:r>
-    </w:p>
-    <w:p>
-      <w:r>
-        <w:t xml:space="preserve">    ON Fact_NegociacionLead (KeyTiempo, KeySede, KeyNegociador, KeyServicio, KeyProfesional);</w:t>
-      </w:r>
-    </w:p>
-    <w:p/>
-    <w:p>
-      <w:r>
-        <w:t>IF NOT EXISTS (SELECT 1 FROM sys.indexes WHERE name = 'UQ_FactGestionPayer_Grain' AND object_id = OBJECT_ID('Fact_GestionPayer'))</w:t>
-      </w:r>
-    </w:p>
-    <w:p>
-      <w:r>
         <w:t xml:space="preserve">    CREATE UNIQUE NONCLUSTERED INDEX UQ_FactGestionPayer_Grain </w:t>
       </w:r>
     </w:p>
-    <w:p>
-      <w:r>
-        <w:t xml:space="preserve">    ON Fact_GestionPayer (KeyTiempo, KeyPasarela, KeyCobro, KeySede, KeyServicio);</w:t>
-      </w:r>
-    </w:p>
-    <w:p/>
-    <w:p>
-      <w:r>
-        <w:t>IF NOT EXISTS (SELECT 1 FROM sys.indexes WHERE name = 'UQ_FactAtencionCustomer_Grain' AND object_id = OBJECT_ID('Fact_AtencionCustomer'))</w:t>
-      </w:r>
-    </w:p>
+    <w:p/>
     <w:p>
       <w:r>
         <w:t xml:space="preserve">    CREATE UNIQUE NONCLUSTERED INDEX UQ_FactAtencionCustomer_Grain </w:t>
       </w:r>
     </w:p>
-    <w:p>
-      <w:r>
-        <w:t xml:space="preserve">    ON Fact_AtencionCustomer (KeyTiempo, KeySede, KeyServicio, KeyProfesional, KeyEstadoAtencion);</w:t>
-      </w:r>
-    </w:p>
-    <w:p/>
-    <w:p>
-      <w:r>
-        <w:t>IF NOT EXISTS (SELECT 1 FROM sys.indexes WHERE name = 'UQ_FactSeguimientoTurned_Grain' AND object_id = OBJECT_ID('Fact_SeguimientoTurned'))</w:t>
-      </w:r>
-    </w:p>
+    <w:p/>
     <w:p>
       <w:r>
         <w:t xml:space="preserve">    CREATE UNIQUE NONCLUSTERED INDEX UQ_FactSeguimientoTurned_Grain </w:t>
@@ -8022,20 +8038,7 @@
     </w:p>
     <w:p>
       <w:r>
-        <w:t xml:space="preserve">    ON Fact_SeguimientoTurned (KeyTiempo, KeySede, KeyServicio, KeyProfesional, KeyCanal);</w:t>
-      </w:r>
-    </w:p>
-    <w:p>
-      <w:r>
-        <w:t>GO</w:t>
-      </w:r>
-    </w:p>
-    <w:p>
-      <w:pPr>
-        <w:pStyle w:val="Heading1"/>
-      </w:pPr>
-      <w:r>
-        <w:t>Anexo E. Poblamiento Inicial y Homologación de Dimensiones (SCD Tipo 1 y Miembros Desconocidos Key = 0)</w:t>
+        <w:t>GO</w:t>
       </w:r>
     </w:p>
     <w:p>
@@ -8045,49 +8048,23 @@
     </w:p>
     <w:p>
       <w:r>
-        <w:t>-- ====================================================================</w:t>
-      </w:r>
-    </w:p>
-    <w:p>
-      <w:r>
         <w:t>-- NEXOSALUD — DATA MART DIMENSIONAL (NexoSalud_Mart)</w:t>
       </w:r>
     </w:p>
     <w:p>
       <w:r>
-        <w:t>-- POBLAMIENTO INICIAL, MIEMBROS CANÓNICOS (KEY=0) Y HOMOLOGACIÓN SCD TIPO 1</w:t>
-      </w:r>
-    </w:p>
-    <w:p>
-      <w:r>
         <w:t>-- Motor: Microsoft SQL Server 2019 / 2022</w:t>
       </w:r>
     </w:p>
-    <w:p>
-      <w:r>
-        <w:t>-- ====================================================================</w:t>
-      </w:r>
-    </w:p>
-    <w:p/>
-    <w:p>
-      <w:r>
-        <w:t>USE NexoSalud_Mart;</w:t>
-      </w:r>
-    </w:p>
-    <w:p>
-      <w:r>
-        <w:t>GO</w:t>
-      </w:r>
-    </w:p>
-    <w:p/>
+    <w:p/>
+    <w:p>
+      <w:r>
+        <w:t>GO</w:t>
+      </w:r>
+    </w:p>
     <w:p>
       <w:r>
         <w:t>SET ANSI_NULLS ON;</w:t>
-      </w:r>
-    </w:p>
-    <w:p>
-      <w:r>
-        <w:t>GO</w:t>
       </w:r>
     </w:p>
     <w:p>

</xml_diff>